<commit_message>
feat: Add customer login requirement and 5 customer accounts (khach01-khach05)
</commit_message>
<xml_diff>
--- a/Huong_Dan_Su_Dung_CS_Studio.docx
+++ b/Huong_Dan_Su_Dung_CS_Studio.docx
@@ -203,7 +203,7 @@
               <w:rPr>
                 <w:sz w:val="20"/>
               </w:rPr>
-              <w:t>Khách hàng truy cập tự do (KHÔNG cần đăng nhập). Có nút '🔐 Cổng CSKH' ở góc trên.</w:t>
+              <w:t>Khách hàng đăng nhập tài khoản Khách hàng (khach01 - khach05) để bắt đầu trò chuyện trực tuyến.</w:t>
             </w:r>
           </w:p>
         </w:tc>
@@ -265,7 +265,7 @@
               <w:rPr>
                 <w:sz w:val="20"/>
               </w:rPr>
-              <w:t>Dành cho Chuyên viên CSKH &amp; Admin (Bắt buộc đăng nhập tài khoản nội bộ).</w:t>
+              <w:t>Dành cho Chuyên viên CSKH &amp; Admin (Đăng nhập tài khoản nội bộ cskh01 - cskh05 hoặc admin).</w:t>
             </w:r>
           </w:p>
         </w:tc>
@@ -281,7 +281,7 @@
         <w:rPr>
           <w:b/>
         </w:rPr>
-        <w:t>🔑 Danh sách tài khoản đăng nhập nội bộ:</w:t>
+        <w:t>🔑 A. Danh sách tài khoản Quản trị &amp; Chuyên viên CSKH (Đăng nhập CS Studio):</w:t>
       </w:r>
     </w:p>
     <w:tbl>
@@ -337,7 +337,7 @@
                 <w:color w:val="FFFFFF"/>
                 <w:sz w:val="20"/>
               </w:rPr>
-              <w:t>Tên Đăng Nhập (Username)</w:t>
+              <w:t>Tên Đăng Nhập</w:t>
             </w:r>
           </w:p>
         </w:tc>
@@ -359,7 +359,7 @@
                 <w:color w:val="FFFFFF"/>
                 <w:sz w:val="20"/>
               </w:rPr>
-              <w:t>Mật Khẩu (Password)</w:t>
+              <w:t>Mật Khẩu</w:t>
             </w:r>
           </w:p>
         </w:tc>
@@ -381,7 +381,7 @@
                 <w:color w:val="FFFFFF"/>
                 <w:sz w:val="20"/>
               </w:rPr>
-              <w:t>Họ Tên &amp; Vai Trò</w:t>
+              <w:t>Họ Tên &amp; Quyền Hạn</w:t>
             </w:r>
           </w:p>
         </w:tc>
@@ -874,6 +874,532 @@
                 <w:sz w:val="19"/>
               </w:rPr>
               <w:t>Chuyên viên CSKH 05 (Tiếp nhận chat &amp; đóng case)</w:t>
+            </w:r>
+          </w:p>
+        </w:tc>
+      </w:tr>
+    </w:tbl>
+    <w:p>
+      <w:pPr>
+        <w:spacing w:after="160"/>
+      </w:pPr>
+    </w:p>
+    <w:p>
+      <w:r>
+        <w:rPr>
+          <w:b/>
+        </w:rPr>
+        <w:t>👤 B. Danh sách 5 tài khoản Khách hàng (Đăng nhập Chat Tư Vấn):</w:t>
+      </w:r>
+    </w:p>
+    <w:tbl>
+      <w:tblPr>
+        <w:tblW w:type="auto" w:w="0"/>
+        <w:jc w:val="center"/>
+        <w:tblLook w:firstColumn="1" w:firstRow="1" w:lastColumn="0" w:lastRow="0" w:noHBand="0" w:noVBand="1" w:val="04A0"/>
+      </w:tblPr>
+      <w:tblGrid>
+        <w:gridCol w:w="2484"/>
+        <w:gridCol w:w="2484"/>
+        <w:gridCol w:w="2484"/>
+        <w:gridCol w:w="2484"/>
+      </w:tblGrid>
+      <w:tr>
+        <w:tc>
+          <w:tcPr>
+            <w:tcW w:type="dxa" w:w="2484"/>
+            <w:shd w:fill="059669"/>
+            <w:tcMar>
+              <w:top w:w="120" w:type="dxa"/>
+              <w:bottom w:w="120" w:type="dxa"/>
+              <w:left w:w="150" w:type="dxa"/>
+              <w:right w:w="150" w:type="dxa"/>
+            </w:tcMar>
+          </w:tcPr>
+          <w:p>
+            <w:r>
+              <w:rPr>
+                <w:b/>
+                <w:color w:val="FFFFFF"/>
+                <w:sz w:val="20"/>
+              </w:rPr>
+              <w:t>STT</w:t>
+            </w:r>
+          </w:p>
+        </w:tc>
+        <w:tc>
+          <w:tcPr>
+            <w:tcW w:type="dxa" w:w="2484"/>
+            <w:shd w:fill="059669"/>
+            <w:tcMar>
+              <w:top w:w="120" w:type="dxa"/>
+              <w:bottom w:w="120" w:type="dxa"/>
+              <w:left w:w="150" w:type="dxa"/>
+              <w:right w:w="150" w:type="dxa"/>
+            </w:tcMar>
+          </w:tcPr>
+          <w:p>
+            <w:r>
+              <w:rPr>
+                <w:b/>
+                <w:color w:val="FFFFFF"/>
+                <w:sz w:val="20"/>
+              </w:rPr>
+              <w:t>Tên Đăng Nhập</w:t>
+            </w:r>
+          </w:p>
+        </w:tc>
+        <w:tc>
+          <w:tcPr>
+            <w:tcW w:type="dxa" w:w="2484"/>
+            <w:shd w:fill="059669"/>
+            <w:tcMar>
+              <w:top w:w="120" w:type="dxa"/>
+              <w:bottom w:w="120" w:type="dxa"/>
+              <w:left w:w="150" w:type="dxa"/>
+              <w:right w:w="150" w:type="dxa"/>
+            </w:tcMar>
+          </w:tcPr>
+          <w:p>
+            <w:r>
+              <w:rPr>
+                <w:b/>
+                <w:color w:val="FFFFFF"/>
+                <w:sz w:val="20"/>
+              </w:rPr>
+              <w:t>Mật Khẩu</w:t>
+            </w:r>
+          </w:p>
+        </w:tc>
+        <w:tc>
+          <w:tcPr>
+            <w:tcW w:type="dxa" w:w="2484"/>
+            <w:shd w:fill="059669"/>
+            <w:tcMar>
+              <w:top w:w="120" w:type="dxa"/>
+              <w:bottom w:w="120" w:type="dxa"/>
+              <w:left w:w="150" w:type="dxa"/>
+              <w:right w:w="150" w:type="dxa"/>
+            </w:tcMar>
+          </w:tcPr>
+          <w:p>
+            <w:r>
+              <w:rPr>
+                <w:b/>
+                <w:color w:val="FFFFFF"/>
+                <w:sz w:val="20"/>
+              </w:rPr>
+              <w:t>Tên Hiển Thị Khách Hàng</w:t>
+            </w:r>
+          </w:p>
+        </w:tc>
+      </w:tr>
+      <w:tr>
+        <w:tc>
+          <w:tcPr>
+            <w:tcW w:type="dxa" w:w="2484"/>
+            <w:shd w:fill="f8fafc"/>
+            <w:tcMar>
+              <w:top w:w="80" w:type="dxa"/>
+              <w:bottom w:w="80" w:type="dxa"/>
+              <w:left w:w="120" w:type="dxa"/>
+              <w:right w:w="120" w:type="dxa"/>
+            </w:tcMar>
+          </w:tcPr>
+          <w:p>
+            <w:r>
+              <w:rPr>
+                <w:sz w:val="19"/>
+              </w:rPr>
+              <w:t>1</w:t>
+            </w:r>
+          </w:p>
+        </w:tc>
+        <w:tc>
+          <w:tcPr>
+            <w:tcW w:type="dxa" w:w="2484"/>
+            <w:shd w:fill="f8fafc"/>
+            <w:tcMar>
+              <w:top w:w="80" w:type="dxa"/>
+              <w:bottom w:w="80" w:type="dxa"/>
+              <w:left w:w="120" w:type="dxa"/>
+              <w:right w:w="120" w:type="dxa"/>
+            </w:tcMar>
+          </w:tcPr>
+          <w:p>
+            <w:r>
+              <w:rPr>
+                <w:sz w:val="19"/>
+              </w:rPr>
+              <w:t>khach01</w:t>
+            </w:r>
+          </w:p>
+        </w:tc>
+        <w:tc>
+          <w:tcPr>
+            <w:tcW w:type="dxa" w:w="2484"/>
+            <w:shd w:fill="f8fafc"/>
+            <w:tcMar>
+              <w:top w:w="80" w:type="dxa"/>
+              <w:bottom w:w="80" w:type="dxa"/>
+              <w:left w:w="120" w:type="dxa"/>
+              <w:right w:w="120" w:type="dxa"/>
+            </w:tcMar>
+          </w:tcPr>
+          <w:p>
+            <w:r>
+              <w:rPr>
+                <w:sz w:val="19"/>
+              </w:rPr>
+              <w:t>DongDo@123</w:t>
+            </w:r>
+          </w:p>
+        </w:tc>
+        <w:tc>
+          <w:tcPr>
+            <w:tcW w:type="dxa" w:w="2484"/>
+            <w:shd w:fill="f8fafc"/>
+            <w:tcMar>
+              <w:top w:w="80" w:type="dxa"/>
+              <w:bottom w:w="80" w:type="dxa"/>
+              <w:left w:w="120" w:type="dxa"/>
+              <w:right w:w="120" w:type="dxa"/>
+            </w:tcMar>
+          </w:tcPr>
+          <w:p>
+            <w:r>
+              <w:rPr>
+                <w:sz w:val="19"/>
+              </w:rPr>
+              <w:t>Khách hàng 01</w:t>
+            </w:r>
+          </w:p>
+        </w:tc>
+      </w:tr>
+      <w:tr>
+        <w:tc>
+          <w:tcPr>
+            <w:tcW w:type="dxa" w:w="2484"/>
+            <w:shd w:fill="ffffff"/>
+            <w:tcMar>
+              <w:top w:w="80" w:type="dxa"/>
+              <w:bottom w:w="80" w:type="dxa"/>
+              <w:left w:w="120" w:type="dxa"/>
+              <w:right w:w="120" w:type="dxa"/>
+            </w:tcMar>
+          </w:tcPr>
+          <w:p>
+            <w:r>
+              <w:rPr>
+                <w:sz w:val="19"/>
+              </w:rPr>
+              <w:t>2</w:t>
+            </w:r>
+          </w:p>
+        </w:tc>
+        <w:tc>
+          <w:tcPr>
+            <w:tcW w:type="dxa" w:w="2484"/>
+            <w:shd w:fill="ffffff"/>
+            <w:tcMar>
+              <w:top w:w="80" w:type="dxa"/>
+              <w:bottom w:w="80" w:type="dxa"/>
+              <w:left w:w="120" w:type="dxa"/>
+              <w:right w:w="120" w:type="dxa"/>
+            </w:tcMar>
+          </w:tcPr>
+          <w:p>
+            <w:r>
+              <w:rPr>
+                <w:sz w:val="19"/>
+              </w:rPr>
+              <w:t>khach02</w:t>
+            </w:r>
+          </w:p>
+        </w:tc>
+        <w:tc>
+          <w:tcPr>
+            <w:tcW w:type="dxa" w:w="2484"/>
+            <w:shd w:fill="ffffff"/>
+            <w:tcMar>
+              <w:top w:w="80" w:type="dxa"/>
+              <w:bottom w:w="80" w:type="dxa"/>
+              <w:left w:w="120" w:type="dxa"/>
+              <w:right w:w="120" w:type="dxa"/>
+            </w:tcMar>
+          </w:tcPr>
+          <w:p>
+            <w:r>
+              <w:rPr>
+                <w:sz w:val="19"/>
+              </w:rPr>
+              <w:t>DongDo@123</w:t>
+            </w:r>
+          </w:p>
+        </w:tc>
+        <w:tc>
+          <w:tcPr>
+            <w:tcW w:type="dxa" w:w="2484"/>
+            <w:shd w:fill="ffffff"/>
+            <w:tcMar>
+              <w:top w:w="80" w:type="dxa"/>
+              <w:bottom w:w="80" w:type="dxa"/>
+              <w:left w:w="120" w:type="dxa"/>
+              <w:right w:w="120" w:type="dxa"/>
+            </w:tcMar>
+          </w:tcPr>
+          <w:p>
+            <w:r>
+              <w:rPr>
+                <w:sz w:val="19"/>
+              </w:rPr>
+              <w:t>Khách hàng 02</w:t>
+            </w:r>
+          </w:p>
+        </w:tc>
+      </w:tr>
+      <w:tr>
+        <w:tc>
+          <w:tcPr>
+            <w:tcW w:type="dxa" w:w="2484"/>
+            <w:shd w:fill="f8fafc"/>
+            <w:tcMar>
+              <w:top w:w="80" w:type="dxa"/>
+              <w:bottom w:w="80" w:type="dxa"/>
+              <w:left w:w="120" w:type="dxa"/>
+              <w:right w:w="120" w:type="dxa"/>
+            </w:tcMar>
+          </w:tcPr>
+          <w:p>
+            <w:r>
+              <w:rPr>
+                <w:sz w:val="19"/>
+              </w:rPr>
+              <w:t>3</w:t>
+            </w:r>
+          </w:p>
+        </w:tc>
+        <w:tc>
+          <w:tcPr>
+            <w:tcW w:type="dxa" w:w="2484"/>
+            <w:shd w:fill="f8fafc"/>
+            <w:tcMar>
+              <w:top w:w="80" w:type="dxa"/>
+              <w:bottom w:w="80" w:type="dxa"/>
+              <w:left w:w="120" w:type="dxa"/>
+              <w:right w:w="120" w:type="dxa"/>
+            </w:tcMar>
+          </w:tcPr>
+          <w:p>
+            <w:r>
+              <w:rPr>
+                <w:sz w:val="19"/>
+              </w:rPr>
+              <w:t>khach03</w:t>
+            </w:r>
+          </w:p>
+        </w:tc>
+        <w:tc>
+          <w:tcPr>
+            <w:tcW w:type="dxa" w:w="2484"/>
+            <w:shd w:fill="f8fafc"/>
+            <w:tcMar>
+              <w:top w:w="80" w:type="dxa"/>
+              <w:bottom w:w="80" w:type="dxa"/>
+              <w:left w:w="120" w:type="dxa"/>
+              <w:right w:w="120" w:type="dxa"/>
+            </w:tcMar>
+          </w:tcPr>
+          <w:p>
+            <w:r>
+              <w:rPr>
+                <w:sz w:val="19"/>
+              </w:rPr>
+              <w:t>DongDo@123</w:t>
+            </w:r>
+          </w:p>
+        </w:tc>
+        <w:tc>
+          <w:tcPr>
+            <w:tcW w:type="dxa" w:w="2484"/>
+            <w:shd w:fill="f8fafc"/>
+            <w:tcMar>
+              <w:top w:w="80" w:type="dxa"/>
+              <w:bottom w:w="80" w:type="dxa"/>
+              <w:left w:w="120" w:type="dxa"/>
+              <w:right w:w="120" w:type="dxa"/>
+            </w:tcMar>
+          </w:tcPr>
+          <w:p>
+            <w:r>
+              <w:rPr>
+                <w:sz w:val="19"/>
+              </w:rPr>
+              <w:t>Khách hàng 03</w:t>
+            </w:r>
+          </w:p>
+        </w:tc>
+      </w:tr>
+      <w:tr>
+        <w:tc>
+          <w:tcPr>
+            <w:tcW w:type="dxa" w:w="2484"/>
+            <w:shd w:fill="ffffff"/>
+            <w:tcMar>
+              <w:top w:w="80" w:type="dxa"/>
+              <w:bottom w:w="80" w:type="dxa"/>
+              <w:left w:w="120" w:type="dxa"/>
+              <w:right w:w="120" w:type="dxa"/>
+            </w:tcMar>
+          </w:tcPr>
+          <w:p>
+            <w:r>
+              <w:rPr>
+                <w:sz w:val="19"/>
+              </w:rPr>
+              <w:t>4</w:t>
+            </w:r>
+          </w:p>
+        </w:tc>
+        <w:tc>
+          <w:tcPr>
+            <w:tcW w:type="dxa" w:w="2484"/>
+            <w:shd w:fill="ffffff"/>
+            <w:tcMar>
+              <w:top w:w="80" w:type="dxa"/>
+              <w:bottom w:w="80" w:type="dxa"/>
+              <w:left w:w="120" w:type="dxa"/>
+              <w:right w:w="120" w:type="dxa"/>
+            </w:tcMar>
+          </w:tcPr>
+          <w:p>
+            <w:r>
+              <w:rPr>
+                <w:sz w:val="19"/>
+              </w:rPr>
+              <w:t>khach04</w:t>
+            </w:r>
+          </w:p>
+        </w:tc>
+        <w:tc>
+          <w:tcPr>
+            <w:tcW w:type="dxa" w:w="2484"/>
+            <w:shd w:fill="ffffff"/>
+            <w:tcMar>
+              <w:top w:w="80" w:type="dxa"/>
+              <w:bottom w:w="80" w:type="dxa"/>
+              <w:left w:w="120" w:type="dxa"/>
+              <w:right w:w="120" w:type="dxa"/>
+            </w:tcMar>
+          </w:tcPr>
+          <w:p>
+            <w:r>
+              <w:rPr>
+                <w:sz w:val="19"/>
+              </w:rPr>
+              <w:t>DongDo@123</w:t>
+            </w:r>
+          </w:p>
+        </w:tc>
+        <w:tc>
+          <w:tcPr>
+            <w:tcW w:type="dxa" w:w="2484"/>
+            <w:shd w:fill="ffffff"/>
+            <w:tcMar>
+              <w:top w:w="80" w:type="dxa"/>
+              <w:bottom w:w="80" w:type="dxa"/>
+              <w:left w:w="120" w:type="dxa"/>
+              <w:right w:w="120" w:type="dxa"/>
+            </w:tcMar>
+          </w:tcPr>
+          <w:p>
+            <w:r>
+              <w:rPr>
+                <w:sz w:val="19"/>
+              </w:rPr>
+              <w:t>Khách hàng 04</w:t>
+            </w:r>
+          </w:p>
+        </w:tc>
+      </w:tr>
+      <w:tr>
+        <w:tc>
+          <w:tcPr>
+            <w:tcW w:type="dxa" w:w="2484"/>
+            <w:shd w:fill="f8fafc"/>
+            <w:tcMar>
+              <w:top w:w="80" w:type="dxa"/>
+              <w:bottom w:w="80" w:type="dxa"/>
+              <w:left w:w="120" w:type="dxa"/>
+              <w:right w:w="120" w:type="dxa"/>
+            </w:tcMar>
+          </w:tcPr>
+          <w:p>
+            <w:r>
+              <w:rPr>
+                <w:sz w:val="19"/>
+              </w:rPr>
+              <w:t>5</w:t>
+            </w:r>
+          </w:p>
+        </w:tc>
+        <w:tc>
+          <w:tcPr>
+            <w:tcW w:type="dxa" w:w="2484"/>
+            <w:shd w:fill="f8fafc"/>
+            <w:tcMar>
+              <w:top w:w="80" w:type="dxa"/>
+              <w:bottom w:w="80" w:type="dxa"/>
+              <w:left w:w="120" w:type="dxa"/>
+              <w:right w:w="120" w:type="dxa"/>
+            </w:tcMar>
+          </w:tcPr>
+          <w:p>
+            <w:r>
+              <w:rPr>
+                <w:sz w:val="19"/>
+              </w:rPr>
+              <w:t>khach05</w:t>
+            </w:r>
+          </w:p>
+        </w:tc>
+        <w:tc>
+          <w:tcPr>
+            <w:tcW w:type="dxa" w:w="2484"/>
+            <w:shd w:fill="f8fafc"/>
+            <w:tcMar>
+              <w:top w:w="80" w:type="dxa"/>
+              <w:bottom w:w="80" w:type="dxa"/>
+              <w:left w:w="120" w:type="dxa"/>
+              <w:right w:w="120" w:type="dxa"/>
+            </w:tcMar>
+          </w:tcPr>
+          <w:p>
+            <w:r>
+              <w:rPr>
+                <w:sz w:val="19"/>
+              </w:rPr>
+              <w:t>DongDo@123</w:t>
+            </w:r>
+          </w:p>
+        </w:tc>
+        <w:tc>
+          <w:tcPr>
+            <w:tcW w:type="dxa" w:w="2484"/>
+            <w:shd w:fill="f8fafc"/>
+            <w:tcMar>
+              <w:top w:w="80" w:type="dxa"/>
+              <w:bottom w:w="80" w:type="dxa"/>
+              <w:left w:w="120" w:type="dxa"/>
+              <w:right w:w="120" w:type="dxa"/>
+            </w:tcMar>
+          </w:tcPr>
+          <w:p>
+            <w:r>
+              <w:rPr>
+                <w:sz w:val="19"/>
+              </w:rPr>
+              <w:t>Khách hàng 05</w:t>
             </w:r>
           </w:p>
         </w:tc>

</xml_diff>

<commit_message>
docs: Remove sensitive credentials tables from CS Studio guide docx
</commit_message>
<xml_diff>
--- a/Huong_Dan_Su_Dung_CS_Studio.docx
+++ b/Huong_Dan_Su_Dung_CS_Studio.docx
@@ -58,12 +58,12 @@
           <w:color w:val="2563EB"/>
           <w:sz w:val="28"/>
         </w:rPr>
-        <w:t>1. Thông Tin Truy Cập &amp; Danh Sách Tài Khoản</w:t>
+        <w:t>1. Thông Tin Truy Cập &amp; Phân Hệ Hệ Thống</w:t>
       </w:r>
     </w:p>
     <w:p>
       <w:r>
-        <w:t>Hệ thống hỗ trợ khách hàng của Đông Đô Partners được chia làm 2 phân hệ rõ ràng:</w:t>
+        <w:t>Hệ thống hỗ trợ khách hàng thông minh của Đông Đô Partners được chia làm 2 phân hệ hoạt động song song:</w:t>
       </w:r>
     </w:p>
     <w:tbl>
@@ -141,7 +141,7 @@
                 <w:color w:val="FFFFFF"/>
                 <w:sz w:val="21"/>
               </w:rPr>
-              <w:t>Đối Tượng Sử Dụng</w:t>
+              <w:t>Đối Tượng &amp; Mục Đích Sử Dụng</w:t>
             </w:r>
           </w:p>
         </w:tc>
@@ -203,7 +203,7 @@
               <w:rPr>
                 <w:sz w:val="20"/>
               </w:rPr>
-              <w:t>Khách hàng đăng nhập tài khoản Khách hàng (khach01 - khach05) để bắt đầu trò chuyện trực tuyến.</w:t>
+              <w:t>Khách hàng đăng nhập tài khoản Khách hàng được cấp để bắt đầu trò chuyện tư vấn trực tuyến với AI và Chuyên viên CSKH.</w:t>
             </w:r>
           </w:p>
         </w:tc>
@@ -265,615 +265,7 @@
               <w:rPr>
                 <w:sz w:val="20"/>
               </w:rPr>
-              <w:t>Dành cho Chuyên viên CSKH &amp; Admin (Đăng nhập tài khoản nội bộ cskh01 - cskh05 hoặc admin).</w:t>
-            </w:r>
-          </w:p>
-        </w:tc>
-      </w:tr>
-    </w:tbl>
-    <w:p>
-      <w:pPr>
-        <w:spacing w:after="80"/>
-      </w:pPr>
-    </w:p>
-    <w:p>
-      <w:r>
-        <w:rPr>
-          <w:b/>
-        </w:rPr>
-        <w:t>🔑 A. Danh sách tài khoản Quản trị &amp; Chuyên viên CSKH (Đăng nhập CS Studio):</w:t>
-      </w:r>
-    </w:p>
-    <w:tbl>
-      <w:tblPr>
-        <w:tblW w:type="auto" w:w="0"/>
-        <w:jc w:val="center"/>
-        <w:tblLook w:firstColumn="1" w:firstRow="1" w:lastColumn="0" w:lastRow="0" w:noHBand="0" w:noVBand="1" w:val="04A0"/>
-      </w:tblPr>
-      <w:tblGrid>
-        <w:gridCol w:w="2484"/>
-        <w:gridCol w:w="2484"/>
-        <w:gridCol w:w="2484"/>
-        <w:gridCol w:w="2484"/>
-      </w:tblGrid>
-      <w:tr>
-        <w:tc>
-          <w:tcPr>
-            <w:tcW w:type="dxa" w:w="2484"/>
-            <w:shd w:fill="2563eb"/>
-            <w:tcMar>
-              <w:top w:w="120" w:type="dxa"/>
-              <w:bottom w:w="120" w:type="dxa"/>
-              <w:left w:w="150" w:type="dxa"/>
-              <w:right w:w="150" w:type="dxa"/>
-            </w:tcMar>
-          </w:tcPr>
-          <w:p>
-            <w:r>
-              <w:rPr>
-                <w:b/>
-                <w:color w:val="FFFFFF"/>
-                <w:sz w:val="20"/>
-              </w:rPr>
-              <w:t>STT</w:t>
-            </w:r>
-          </w:p>
-        </w:tc>
-        <w:tc>
-          <w:tcPr>
-            <w:tcW w:type="dxa" w:w="2484"/>
-            <w:shd w:fill="2563eb"/>
-            <w:tcMar>
-              <w:top w:w="120" w:type="dxa"/>
-              <w:bottom w:w="120" w:type="dxa"/>
-              <w:left w:w="150" w:type="dxa"/>
-              <w:right w:w="150" w:type="dxa"/>
-            </w:tcMar>
-          </w:tcPr>
-          <w:p>
-            <w:r>
-              <w:rPr>
-                <w:b/>
-                <w:color w:val="FFFFFF"/>
-                <w:sz w:val="20"/>
-              </w:rPr>
-              <w:t>Tên Đăng Nhập</w:t>
-            </w:r>
-          </w:p>
-        </w:tc>
-        <w:tc>
-          <w:tcPr>
-            <w:tcW w:type="dxa" w:w="2484"/>
-            <w:shd w:fill="2563eb"/>
-            <w:tcMar>
-              <w:top w:w="120" w:type="dxa"/>
-              <w:bottom w:w="120" w:type="dxa"/>
-              <w:left w:w="150" w:type="dxa"/>
-              <w:right w:w="150" w:type="dxa"/>
-            </w:tcMar>
-          </w:tcPr>
-          <w:p>
-            <w:r>
-              <w:rPr>
-                <w:b/>
-                <w:color w:val="FFFFFF"/>
-                <w:sz w:val="20"/>
-              </w:rPr>
-              <w:t>Mật Khẩu</w:t>
-            </w:r>
-          </w:p>
-        </w:tc>
-        <w:tc>
-          <w:tcPr>
-            <w:tcW w:type="dxa" w:w="2484"/>
-            <w:shd w:fill="2563eb"/>
-            <w:tcMar>
-              <w:top w:w="120" w:type="dxa"/>
-              <w:bottom w:w="120" w:type="dxa"/>
-              <w:left w:w="150" w:type="dxa"/>
-              <w:right w:w="150" w:type="dxa"/>
-            </w:tcMar>
-          </w:tcPr>
-          <w:p>
-            <w:r>
-              <w:rPr>
-                <w:b/>
-                <w:color w:val="FFFFFF"/>
-                <w:sz w:val="20"/>
-              </w:rPr>
-              <w:t>Họ Tên &amp; Quyền Hạn</w:t>
-            </w:r>
-          </w:p>
-        </w:tc>
-      </w:tr>
-      <w:tr>
-        <w:tc>
-          <w:tcPr>
-            <w:tcW w:type="dxa" w:w="2484"/>
-            <w:shd w:fill="f8fafc"/>
-            <w:tcMar>
-              <w:top w:w="80" w:type="dxa"/>
-              <w:bottom w:w="80" w:type="dxa"/>
-              <w:left w:w="120" w:type="dxa"/>
-              <w:right w:w="120" w:type="dxa"/>
-            </w:tcMar>
-          </w:tcPr>
-          <w:p>
-            <w:r>
-              <w:rPr>
-                <w:sz w:val="19"/>
-              </w:rPr>
-              <w:t>1</w:t>
-            </w:r>
-          </w:p>
-        </w:tc>
-        <w:tc>
-          <w:tcPr>
-            <w:tcW w:type="dxa" w:w="2484"/>
-            <w:shd w:fill="f8fafc"/>
-            <w:tcMar>
-              <w:top w:w="80" w:type="dxa"/>
-              <w:bottom w:w="80" w:type="dxa"/>
-              <w:left w:w="120" w:type="dxa"/>
-              <w:right w:w="120" w:type="dxa"/>
-            </w:tcMar>
-          </w:tcPr>
-          <w:p>
-            <w:r>
-              <w:rPr>
-                <w:sz w:val="19"/>
-              </w:rPr>
-              <w:t>admin</w:t>
-            </w:r>
-          </w:p>
-        </w:tc>
-        <w:tc>
-          <w:tcPr>
-            <w:tcW w:type="dxa" w:w="2484"/>
-            <w:shd w:fill="f8fafc"/>
-            <w:tcMar>
-              <w:top w:w="80" w:type="dxa"/>
-              <w:bottom w:w="80" w:type="dxa"/>
-              <w:left w:w="120" w:type="dxa"/>
-              <w:right w:w="120" w:type="dxa"/>
-            </w:tcMar>
-          </w:tcPr>
-          <w:p>
-            <w:r>
-              <w:rPr>
-                <w:sz w:val="19"/>
-              </w:rPr>
-              <w:t>DongDo@2026</w:t>
-            </w:r>
-          </w:p>
-        </w:tc>
-        <w:tc>
-          <w:tcPr>
-            <w:tcW w:type="dxa" w:w="2484"/>
-            <w:shd w:fill="f8fafc"/>
-            <w:tcMar>
-              <w:top w:w="80" w:type="dxa"/>
-              <w:bottom w:w="80" w:type="dxa"/>
-              <w:left w:w="120" w:type="dxa"/>
-              <w:right w:w="120" w:type="dxa"/>
-            </w:tcMar>
-          </w:tcPr>
-          <w:p>
-            <w:r>
-              <w:rPr>
-                <w:sz w:val="19"/>
-              </w:rPr>
-              <w:t>Quản Trị Viên (Toàn quyền quản lý, nạp/xóa tri thức, cấu hình)</w:t>
-            </w:r>
-          </w:p>
-        </w:tc>
-      </w:tr>
-      <w:tr>
-        <w:tc>
-          <w:tcPr>
-            <w:tcW w:type="dxa" w:w="2484"/>
-            <w:shd w:fill="ffffff"/>
-            <w:tcMar>
-              <w:top w:w="80" w:type="dxa"/>
-              <w:bottom w:w="80" w:type="dxa"/>
-              <w:left w:w="120" w:type="dxa"/>
-              <w:right w:w="120" w:type="dxa"/>
-            </w:tcMar>
-          </w:tcPr>
-          <w:p>
-            <w:r>
-              <w:rPr>
-                <w:sz w:val="19"/>
-              </w:rPr>
-              <w:t>2</w:t>
-            </w:r>
-          </w:p>
-        </w:tc>
-        <w:tc>
-          <w:tcPr>
-            <w:tcW w:type="dxa" w:w="2484"/>
-            <w:shd w:fill="ffffff"/>
-            <w:tcMar>
-              <w:top w:w="80" w:type="dxa"/>
-              <w:bottom w:w="80" w:type="dxa"/>
-              <w:left w:w="120" w:type="dxa"/>
-              <w:right w:w="120" w:type="dxa"/>
-            </w:tcMar>
-          </w:tcPr>
-          <w:p>
-            <w:r>
-              <w:rPr>
-                <w:sz w:val="19"/>
-              </w:rPr>
-              <w:t>cskh01</w:t>
-            </w:r>
-          </w:p>
-        </w:tc>
-        <w:tc>
-          <w:tcPr>
-            <w:tcW w:type="dxa" w:w="2484"/>
-            <w:shd w:fill="ffffff"/>
-            <w:tcMar>
-              <w:top w:w="80" w:type="dxa"/>
-              <w:bottom w:w="80" w:type="dxa"/>
-              <w:left w:w="120" w:type="dxa"/>
-              <w:right w:w="120" w:type="dxa"/>
-            </w:tcMar>
-          </w:tcPr>
-          <w:p>
-            <w:r>
-              <w:rPr>
-                <w:sz w:val="19"/>
-              </w:rPr>
-              <w:t>DongDo@123</w:t>
-            </w:r>
-          </w:p>
-        </w:tc>
-        <w:tc>
-          <w:tcPr>
-            <w:tcW w:type="dxa" w:w="2484"/>
-            <w:shd w:fill="ffffff"/>
-            <w:tcMar>
-              <w:top w:w="80" w:type="dxa"/>
-              <w:bottom w:w="80" w:type="dxa"/>
-              <w:left w:w="120" w:type="dxa"/>
-              <w:right w:w="120" w:type="dxa"/>
-            </w:tcMar>
-          </w:tcPr>
-          <w:p>
-            <w:r>
-              <w:rPr>
-                <w:sz w:val="19"/>
-              </w:rPr>
-              <w:t>Chuyên viên CSKH 01 (Tiếp nhận chat &amp; đóng case)</w:t>
-            </w:r>
-          </w:p>
-        </w:tc>
-      </w:tr>
-      <w:tr>
-        <w:tc>
-          <w:tcPr>
-            <w:tcW w:type="dxa" w:w="2484"/>
-            <w:shd w:fill="f8fafc"/>
-            <w:tcMar>
-              <w:top w:w="80" w:type="dxa"/>
-              <w:bottom w:w="80" w:type="dxa"/>
-              <w:left w:w="120" w:type="dxa"/>
-              <w:right w:w="120" w:type="dxa"/>
-            </w:tcMar>
-          </w:tcPr>
-          <w:p>
-            <w:r>
-              <w:rPr>
-                <w:sz w:val="19"/>
-              </w:rPr>
-              <w:t>3</w:t>
-            </w:r>
-          </w:p>
-        </w:tc>
-        <w:tc>
-          <w:tcPr>
-            <w:tcW w:type="dxa" w:w="2484"/>
-            <w:shd w:fill="f8fafc"/>
-            <w:tcMar>
-              <w:top w:w="80" w:type="dxa"/>
-              <w:bottom w:w="80" w:type="dxa"/>
-              <w:left w:w="120" w:type="dxa"/>
-              <w:right w:w="120" w:type="dxa"/>
-            </w:tcMar>
-          </w:tcPr>
-          <w:p>
-            <w:r>
-              <w:rPr>
-                <w:sz w:val="19"/>
-              </w:rPr>
-              <w:t>cskh02</w:t>
-            </w:r>
-          </w:p>
-        </w:tc>
-        <w:tc>
-          <w:tcPr>
-            <w:tcW w:type="dxa" w:w="2484"/>
-            <w:shd w:fill="f8fafc"/>
-            <w:tcMar>
-              <w:top w:w="80" w:type="dxa"/>
-              <w:bottom w:w="80" w:type="dxa"/>
-              <w:left w:w="120" w:type="dxa"/>
-              <w:right w:w="120" w:type="dxa"/>
-            </w:tcMar>
-          </w:tcPr>
-          <w:p>
-            <w:r>
-              <w:rPr>
-                <w:sz w:val="19"/>
-              </w:rPr>
-              <w:t>DongDo@123</w:t>
-            </w:r>
-          </w:p>
-        </w:tc>
-        <w:tc>
-          <w:tcPr>
-            <w:tcW w:type="dxa" w:w="2484"/>
-            <w:shd w:fill="f8fafc"/>
-            <w:tcMar>
-              <w:top w:w="80" w:type="dxa"/>
-              <w:bottom w:w="80" w:type="dxa"/>
-              <w:left w:w="120" w:type="dxa"/>
-              <w:right w:w="120" w:type="dxa"/>
-            </w:tcMar>
-          </w:tcPr>
-          <w:p>
-            <w:r>
-              <w:rPr>
-                <w:sz w:val="19"/>
-              </w:rPr>
-              <w:t>Chuyên viên CSKH 02 (Tiếp nhận chat &amp; đóng case)</w:t>
-            </w:r>
-          </w:p>
-        </w:tc>
-      </w:tr>
-      <w:tr>
-        <w:tc>
-          <w:tcPr>
-            <w:tcW w:type="dxa" w:w="2484"/>
-            <w:shd w:fill="ffffff"/>
-            <w:tcMar>
-              <w:top w:w="80" w:type="dxa"/>
-              <w:bottom w:w="80" w:type="dxa"/>
-              <w:left w:w="120" w:type="dxa"/>
-              <w:right w:w="120" w:type="dxa"/>
-            </w:tcMar>
-          </w:tcPr>
-          <w:p>
-            <w:r>
-              <w:rPr>
-                <w:sz w:val="19"/>
-              </w:rPr>
-              <w:t>4</w:t>
-            </w:r>
-          </w:p>
-        </w:tc>
-        <w:tc>
-          <w:tcPr>
-            <w:tcW w:type="dxa" w:w="2484"/>
-            <w:shd w:fill="ffffff"/>
-            <w:tcMar>
-              <w:top w:w="80" w:type="dxa"/>
-              <w:bottom w:w="80" w:type="dxa"/>
-              <w:left w:w="120" w:type="dxa"/>
-              <w:right w:w="120" w:type="dxa"/>
-            </w:tcMar>
-          </w:tcPr>
-          <w:p>
-            <w:r>
-              <w:rPr>
-                <w:sz w:val="19"/>
-              </w:rPr>
-              <w:t>cskh03</w:t>
-            </w:r>
-          </w:p>
-        </w:tc>
-        <w:tc>
-          <w:tcPr>
-            <w:tcW w:type="dxa" w:w="2484"/>
-            <w:shd w:fill="ffffff"/>
-            <w:tcMar>
-              <w:top w:w="80" w:type="dxa"/>
-              <w:bottom w:w="80" w:type="dxa"/>
-              <w:left w:w="120" w:type="dxa"/>
-              <w:right w:w="120" w:type="dxa"/>
-            </w:tcMar>
-          </w:tcPr>
-          <w:p>
-            <w:r>
-              <w:rPr>
-                <w:sz w:val="19"/>
-              </w:rPr>
-              <w:t>DongDo@123</w:t>
-            </w:r>
-          </w:p>
-        </w:tc>
-        <w:tc>
-          <w:tcPr>
-            <w:tcW w:type="dxa" w:w="2484"/>
-            <w:shd w:fill="ffffff"/>
-            <w:tcMar>
-              <w:top w:w="80" w:type="dxa"/>
-              <w:bottom w:w="80" w:type="dxa"/>
-              <w:left w:w="120" w:type="dxa"/>
-              <w:right w:w="120" w:type="dxa"/>
-            </w:tcMar>
-          </w:tcPr>
-          <w:p>
-            <w:r>
-              <w:rPr>
-                <w:sz w:val="19"/>
-              </w:rPr>
-              <w:t>Chuyên viên CSKH 03 (Tiếp nhận chat &amp; đóng case)</w:t>
-            </w:r>
-          </w:p>
-        </w:tc>
-      </w:tr>
-      <w:tr>
-        <w:tc>
-          <w:tcPr>
-            <w:tcW w:type="dxa" w:w="2484"/>
-            <w:shd w:fill="f8fafc"/>
-            <w:tcMar>
-              <w:top w:w="80" w:type="dxa"/>
-              <w:bottom w:w="80" w:type="dxa"/>
-              <w:left w:w="120" w:type="dxa"/>
-              <w:right w:w="120" w:type="dxa"/>
-            </w:tcMar>
-          </w:tcPr>
-          <w:p>
-            <w:r>
-              <w:rPr>
-                <w:sz w:val="19"/>
-              </w:rPr>
-              <w:t>5</w:t>
-            </w:r>
-          </w:p>
-        </w:tc>
-        <w:tc>
-          <w:tcPr>
-            <w:tcW w:type="dxa" w:w="2484"/>
-            <w:shd w:fill="f8fafc"/>
-            <w:tcMar>
-              <w:top w:w="80" w:type="dxa"/>
-              <w:bottom w:w="80" w:type="dxa"/>
-              <w:left w:w="120" w:type="dxa"/>
-              <w:right w:w="120" w:type="dxa"/>
-            </w:tcMar>
-          </w:tcPr>
-          <w:p>
-            <w:r>
-              <w:rPr>
-                <w:sz w:val="19"/>
-              </w:rPr>
-              <w:t>cskh04</w:t>
-            </w:r>
-          </w:p>
-        </w:tc>
-        <w:tc>
-          <w:tcPr>
-            <w:tcW w:type="dxa" w:w="2484"/>
-            <w:shd w:fill="f8fafc"/>
-            <w:tcMar>
-              <w:top w:w="80" w:type="dxa"/>
-              <w:bottom w:w="80" w:type="dxa"/>
-              <w:left w:w="120" w:type="dxa"/>
-              <w:right w:w="120" w:type="dxa"/>
-            </w:tcMar>
-          </w:tcPr>
-          <w:p>
-            <w:r>
-              <w:rPr>
-                <w:sz w:val="19"/>
-              </w:rPr>
-              <w:t>DongDo@123</w:t>
-            </w:r>
-          </w:p>
-        </w:tc>
-        <w:tc>
-          <w:tcPr>
-            <w:tcW w:type="dxa" w:w="2484"/>
-            <w:shd w:fill="f8fafc"/>
-            <w:tcMar>
-              <w:top w:w="80" w:type="dxa"/>
-              <w:bottom w:w="80" w:type="dxa"/>
-              <w:left w:w="120" w:type="dxa"/>
-              <w:right w:w="120" w:type="dxa"/>
-            </w:tcMar>
-          </w:tcPr>
-          <w:p>
-            <w:r>
-              <w:rPr>
-                <w:sz w:val="19"/>
-              </w:rPr>
-              <w:t>Chuyên viên CSKH 04 (Tiếp nhận chat &amp; đóng case)</w:t>
-            </w:r>
-          </w:p>
-        </w:tc>
-      </w:tr>
-      <w:tr>
-        <w:tc>
-          <w:tcPr>
-            <w:tcW w:type="dxa" w:w="2484"/>
-            <w:shd w:fill="ffffff"/>
-            <w:tcMar>
-              <w:top w:w="80" w:type="dxa"/>
-              <w:bottom w:w="80" w:type="dxa"/>
-              <w:left w:w="120" w:type="dxa"/>
-              <w:right w:w="120" w:type="dxa"/>
-            </w:tcMar>
-          </w:tcPr>
-          <w:p>
-            <w:r>
-              <w:rPr>
-                <w:sz w:val="19"/>
-              </w:rPr>
-              <w:t>6</w:t>
-            </w:r>
-          </w:p>
-        </w:tc>
-        <w:tc>
-          <w:tcPr>
-            <w:tcW w:type="dxa" w:w="2484"/>
-            <w:shd w:fill="ffffff"/>
-            <w:tcMar>
-              <w:top w:w="80" w:type="dxa"/>
-              <w:bottom w:w="80" w:type="dxa"/>
-              <w:left w:w="120" w:type="dxa"/>
-              <w:right w:w="120" w:type="dxa"/>
-            </w:tcMar>
-          </w:tcPr>
-          <w:p>
-            <w:r>
-              <w:rPr>
-                <w:sz w:val="19"/>
-              </w:rPr>
-              <w:t>cskh05</w:t>
-            </w:r>
-          </w:p>
-        </w:tc>
-        <w:tc>
-          <w:tcPr>
-            <w:tcW w:type="dxa" w:w="2484"/>
-            <w:shd w:fill="ffffff"/>
-            <w:tcMar>
-              <w:top w:w="80" w:type="dxa"/>
-              <w:bottom w:w="80" w:type="dxa"/>
-              <w:left w:w="120" w:type="dxa"/>
-              <w:right w:w="120" w:type="dxa"/>
-            </w:tcMar>
-          </w:tcPr>
-          <w:p>
-            <w:r>
-              <w:rPr>
-                <w:sz w:val="19"/>
-              </w:rPr>
-              <w:t>DongDo@123</w:t>
-            </w:r>
-          </w:p>
-        </w:tc>
-        <w:tc>
-          <w:tcPr>
-            <w:tcW w:type="dxa" w:w="2484"/>
-            <w:shd w:fill="ffffff"/>
-            <w:tcMar>
-              <w:top w:w="80" w:type="dxa"/>
-              <w:bottom w:w="80" w:type="dxa"/>
-              <w:left w:w="120" w:type="dxa"/>
-              <w:right w:w="120" w:type="dxa"/>
-            </w:tcMar>
-          </w:tcPr>
-          <w:p>
-            <w:r>
-              <w:rPr>
-                <w:sz w:val="19"/>
-              </w:rPr>
-              <w:t>Chuyên viên CSKH 05 (Tiếp nhận chat &amp; đóng case)</w:t>
+              <w:t>Dành cho Chuyên viên CSKH &amp; Quản trị viên đăng nhập để tiếp nhận hỗ trợ, quản lý case và dạy tri thức cho AI.</w:t>
             </w:r>
           </w:p>
         </w:tc>
@@ -888,523 +280,57 @@
       <w:r>
         <w:rPr>
           <w:b/>
+          <w:color w:val="0F172A"/>
         </w:rPr>
-        <w:t>👤 B. Danh sách 5 tài khoản Khách hàng (Đăng nhập Chat Tư Vấn):</w:t>
+        <w:t>🔒 Quy Định Bảo Mật &amp; Quản Lý Tài Khoản:</w:t>
+        <w:br/>
       </w:r>
     </w:p>
-    <w:tbl>
-      <w:tblPr>
-        <w:tblW w:type="auto" w:w="0"/>
-        <w:jc w:val="center"/>
-        <w:tblLook w:firstColumn="1" w:firstRow="1" w:lastColumn="0" w:lastRow="0" w:noHBand="0" w:noVBand="1" w:val="04A0"/>
-      </w:tblPr>
-      <w:tblGrid>
-        <w:gridCol w:w="2484"/>
-        <w:gridCol w:w="2484"/>
-        <w:gridCol w:w="2484"/>
-        <w:gridCol w:w="2484"/>
-      </w:tblGrid>
-      <w:tr>
-        <w:tc>
-          <w:tcPr>
-            <w:tcW w:type="dxa" w:w="2484"/>
-            <w:shd w:fill="059669"/>
-            <w:tcMar>
-              <w:top w:w="120" w:type="dxa"/>
-              <w:bottom w:w="120" w:type="dxa"/>
-              <w:left w:w="150" w:type="dxa"/>
-              <w:right w:w="150" w:type="dxa"/>
-            </w:tcMar>
-          </w:tcPr>
-          <w:p>
-            <w:r>
-              <w:rPr>
-                <w:b/>
-                <w:color w:val="FFFFFF"/>
-                <w:sz w:val="20"/>
-              </w:rPr>
-              <w:t>STT</w:t>
-            </w:r>
-          </w:p>
-        </w:tc>
-        <w:tc>
-          <w:tcPr>
-            <w:tcW w:type="dxa" w:w="2484"/>
-            <w:shd w:fill="059669"/>
-            <w:tcMar>
-              <w:top w:w="120" w:type="dxa"/>
-              <w:bottom w:w="120" w:type="dxa"/>
-              <w:left w:w="150" w:type="dxa"/>
-              <w:right w:w="150" w:type="dxa"/>
-            </w:tcMar>
-          </w:tcPr>
-          <w:p>
-            <w:r>
-              <w:rPr>
-                <w:b/>
-                <w:color w:val="FFFFFF"/>
-                <w:sz w:val="20"/>
-              </w:rPr>
-              <w:t>Tên Đăng Nhập</w:t>
-            </w:r>
-          </w:p>
-        </w:tc>
-        <w:tc>
-          <w:tcPr>
-            <w:tcW w:type="dxa" w:w="2484"/>
-            <w:shd w:fill="059669"/>
-            <w:tcMar>
-              <w:top w:w="120" w:type="dxa"/>
-              <w:bottom w:w="120" w:type="dxa"/>
-              <w:left w:w="150" w:type="dxa"/>
-              <w:right w:w="150" w:type="dxa"/>
-            </w:tcMar>
-          </w:tcPr>
-          <w:p>
-            <w:r>
-              <w:rPr>
-                <w:b/>
-                <w:color w:val="FFFFFF"/>
-                <w:sz w:val="20"/>
-              </w:rPr>
-              <w:t>Mật Khẩu</w:t>
-            </w:r>
-          </w:p>
-        </w:tc>
-        <w:tc>
-          <w:tcPr>
-            <w:tcW w:type="dxa" w:w="2484"/>
-            <w:shd w:fill="059669"/>
-            <w:tcMar>
-              <w:top w:w="120" w:type="dxa"/>
-              <w:bottom w:w="120" w:type="dxa"/>
-              <w:left w:w="150" w:type="dxa"/>
-              <w:right w:w="150" w:type="dxa"/>
-            </w:tcMar>
-          </w:tcPr>
-          <w:p>
-            <w:r>
-              <w:rPr>
-                <w:b/>
-                <w:color w:val="FFFFFF"/>
-                <w:sz w:val="20"/>
-              </w:rPr>
-              <w:t>Tên Hiển Thị Khách Hàng</w:t>
-            </w:r>
-          </w:p>
-        </w:tc>
-      </w:tr>
-      <w:tr>
-        <w:tc>
-          <w:tcPr>
-            <w:tcW w:type="dxa" w:w="2484"/>
-            <w:shd w:fill="f8fafc"/>
-            <w:tcMar>
-              <w:top w:w="80" w:type="dxa"/>
-              <w:bottom w:w="80" w:type="dxa"/>
-              <w:left w:w="120" w:type="dxa"/>
-              <w:right w:w="120" w:type="dxa"/>
-            </w:tcMar>
-          </w:tcPr>
-          <w:p>
-            <w:r>
-              <w:rPr>
-                <w:sz w:val="19"/>
-              </w:rPr>
-              <w:t>1</w:t>
-            </w:r>
-          </w:p>
-        </w:tc>
-        <w:tc>
-          <w:tcPr>
-            <w:tcW w:type="dxa" w:w="2484"/>
-            <w:shd w:fill="f8fafc"/>
-            <w:tcMar>
-              <w:top w:w="80" w:type="dxa"/>
-              <w:bottom w:w="80" w:type="dxa"/>
-              <w:left w:w="120" w:type="dxa"/>
-              <w:right w:w="120" w:type="dxa"/>
-            </w:tcMar>
-          </w:tcPr>
-          <w:p>
-            <w:r>
-              <w:rPr>
-                <w:sz w:val="19"/>
-              </w:rPr>
-              <w:t>khach01</w:t>
-            </w:r>
-          </w:p>
-        </w:tc>
-        <w:tc>
-          <w:tcPr>
-            <w:tcW w:type="dxa" w:w="2484"/>
-            <w:shd w:fill="f8fafc"/>
-            <w:tcMar>
-              <w:top w:w="80" w:type="dxa"/>
-              <w:bottom w:w="80" w:type="dxa"/>
-              <w:left w:w="120" w:type="dxa"/>
-              <w:right w:w="120" w:type="dxa"/>
-            </w:tcMar>
-          </w:tcPr>
-          <w:p>
-            <w:r>
-              <w:rPr>
-                <w:sz w:val="19"/>
-              </w:rPr>
-              <w:t>DongDo@123</w:t>
-            </w:r>
-          </w:p>
-        </w:tc>
-        <w:tc>
-          <w:tcPr>
-            <w:tcW w:type="dxa" w:w="2484"/>
-            <w:shd w:fill="f8fafc"/>
-            <w:tcMar>
-              <w:top w:w="80" w:type="dxa"/>
-              <w:bottom w:w="80" w:type="dxa"/>
-              <w:left w:w="120" w:type="dxa"/>
-              <w:right w:w="120" w:type="dxa"/>
-            </w:tcMar>
-          </w:tcPr>
-          <w:p>
-            <w:r>
-              <w:rPr>
-                <w:sz w:val="19"/>
-              </w:rPr>
-              <w:t>Khách hàng 01</w:t>
-            </w:r>
-          </w:p>
-        </w:tc>
-      </w:tr>
-      <w:tr>
-        <w:tc>
-          <w:tcPr>
-            <w:tcW w:type="dxa" w:w="2484"/>
-            <w:shd w:fill="ffffff"/>
-            <w:tcMar>
-              <w:top w:w="80" w:type="dxa"/>
-              <w:bottom w:w="80" w:type="dxa"/>
-              <w:left w:w="120" w:type="dxa"/>
-              <w:right w:w="120" w:type="dxa"/>
-            </w:tcMar>
-          </w:tcPr>
-          <w:p>
-            <w:r>
-              <w:rPr>
-                <w:sz w:val="19"/>
-              </w:rPr>
-              <w:t>2</w:t>
-            </w:r>
-          </w:p>
-        </w:tc>
-        <w:tc>
-          <w:tcPr>
-            <w:tcW w:type="dxa" w:w="2484"/>
-            <w:shd w:fill="ffffff"/>
-            <w:tcMar>
-              <w:top w:w="80" w:type="dxa"/>
-              <w:bottom w:w="80" w:type="dxa"/>
-              <w:left w:w="120" w:type="dxa"/>
-              <w:right w:w="120" w:type="dxa"/>
-            </w:tcMar>
-          </w:tcPr>
-          <w:p>
-            <w:r>
-              <w:rPr>
-                <w:sz w:val="19"/>
-              </w:rPr>
-              <w:t>khach02</w:t>
-            </w:r>
-          </w:p>
-        </w:tc>
-        <w:tc>
-          <w:tcPr>
-            <w:tcW w:type="dxa" w:w="2484"/>
-            <w:shd w:fill="ffffff"/>
-            <w:tcMar>
-              <w:top w:w="80" w:type="dxa"/>
-              <w:bottom w:w="80" w:type="dxa"/>
-              <w:left w:w="120" w:type="dxa"/>
-              <w:right w:w="120" w:type="dxa"/>
-            </w:tcMar>
-          </w:tcPr>
-          <w:p>
-            <w:r>
-              <w:rPr>
-                <w:sz w:val="19"/>
-              </w:rPr>
-              <w:t>DongDo@123</w:t>
-            </w:r>
-          </w:p>
-        </w:tc>
-        <w:tc>
-          <w:tcPr>
-            <w:tcW w:type="dxa" w:w="2484"/>
-            <w:shd w:fill="ffffff"/>
-            <w:tcMar>
-              <w:top w:w="80" w:type="dxa"/>
-              <w:bottom w:w="80" w:type="dxa"/>
-              <w:left w:w="120" w:type="dxa"/>
-              <w:right w:w="120" w:type="dxa"/>
-            </w:tcMar>
-          </w:tcPr>
-          <w:p>
-            <w:r>
-              <w:rPr>
-                <w:sz w:val="19"/>
-              </w:rPr>
-              <w:t>Khách hàng 02</w:t>
-            </w:r>
-          </w:p>
-        </w:tc>
-      </w:tr>
-      <w:tr>
-        <w:tc>
-          <w:tcPr>
-            <w:tcW w:type="dxa" w:w="2484"/>
-            <w:shd w:fill="f8fafc"/>
-            <w:tcMar>
-              <w:top w:w="80" w:type="dxa"/>
-              <w:bottom w:w="80" w:type="dxa"/>
-              <w:left w:w="120" w:type="dxa"/>
-              <w:right w:w="120" w:type="dxa"/>
-            </w:tcMar>
-          </w:tcPr>
-          <w:p>
-            <w:r>
-              <w:rPr>
-                <w:sz w:val="19"/>
-              </w:rPr>
-              <w:t>3</w:t>
-            </w:r>
-          </w:p>
-        </w:tc>
-        <w:tc>
-          <w:tcPr>
-            <w:tcW w:type="dxa" w:w="2484"/>
-            <w:shd w:fill="f8fafc"/>
-            <w:tcMar>
-              <w:top w:w="80" w:type="dxa"/>
-              <w:bottom w:w="80" w:type="dxa"/>
-              <w:left w:w="120" w:type="dxa"/>
-              <w:right w:w="120" w:type="dxa"/>
-            </w:tcMar>
-          </w:tcPr>
-          <w:p>
-            <w:r>
-              <w:rPr>
-                <w:sz w:val="19"/>
-              </w:rPr>
-              <w:t>khach03</w:t>
-            </w:r>
-          </w:p>
-        </w:tc>
-        <w:tc>
-          <w:tcPr>
-            <w:tcW w:type="dxa" w:w="2484"/>
-            <w:shd w:fill="f8fafc"/>
-            <w:tcMar>
-              <w:top w:w="80" w:type="dxa"/>
-              <w:bottom w:w="80" w:type="dxa"/>
-              <w:left w:w="120" w:type="dxa"/>
-              <w:right w:w="120" w:type="dxa"/>
-            </w:tcMar>
-          </w:tcPr>
-          <w:p>
-            <w:r>
-              <w:rPr>
-                <w:sz w:val="19"/>
-              </w:rPr>
-              <w:t>DongDo@123</w:t>
-            </w:r>
-          </w:p>
-        </w:tc>
-        <w:tc>
-          <w:tcPr>
-            <w:tcW w:type="dxa" w:w="2484"/>
-            <w:shd w:fill="f8fafc"/>
-            <w:tcMar>
-              <w:top w:w="80" w:type="dxa"/>
-              <w:bottom w:w="80" w:type="dxa"/>
-              <w:left w:w="120" w:type="dxa"/>
-              <w:right w:w="120" w:type="dxa"/>
-            </w:tcMar>
-          </w:tcPr>
-          <w:p>
-            <w:r>
-              <w:rPr>
-                <w:sz w:val="19"/>
-              </w:rPr>
-              <w:t>Khách hàng 03</w:t>
-            </w:r>
-          </w:p>
-        </w:tc>
-      </w:tr>
-      <w:tr>
-        <w:tc>
-          <w:tcPr>
-            <w:tcW w:type="dxa" w:w="2484"/>
-            <w:shd w:fill="ffffff"/>
-            <w:tcMar>
-              <w:top w:w="80" w:type="dxa"/>
-              <w:bottom w:w="80" w:type="dxa"/>
-              <w:left w:w="120" w:type="dxa"/>
-              <w:right w:w="120" w:type="dxa"/>
-            </w:tcMar>
-          </w:tcPr>
-          <w:p>
-            <w:r>
-              <w:rPr>
-                <w:sz w:val="19"/>
-              </w:rPr>
-              <w:t>4</w:t>
-            </w:r>
-          </w:p>
-        </w:tc>
-        <w:tc>
-          <w:tcPr>
-            <w:tcW w:type="dxa" w:w="2484"/>
-            <w:shd w:fill="ffffff"/>
-            <w:tcMar>
-              <w:top w:w="80" w:type="dxa"/>
-              <w:bottom w:w="80" w:type="dxa"/>
-              <w:left w:w="120" w:type="dxa"/>
-              <w:right w:w="120" w:type="dxa"/>
-            </w:tcMar>
-          </w:tcPr>
-          <w:p>
-            <w:r>
-              <w:rPr>
-                <w:sz w:val="19"/>
-              </w:rPr>
-              <w:t>khach04</w:t>
-            </w:r>
-          </w:p>
-        </w:tc>
-        <w:tc>
-          <w:tcPr>
-            <w:tcW w:type="dxa" w:w="2484"/>
-            <w:shd w:fill="ffffff"/>
-            <w:tcMar>
-              <w:top w:w="80" w:type="dxa"/>
-              <w:bottom w:w="80" w:type="dxa"/>
-              <w:left w:w="120" w:type="dxa"/>
-              <w:right w:w="120" w:type="dxa"/>
-            </w:tcMar>
-          </w:tcPr>
-          <w:p>
-            <w:r>
-              <w:rPr>
-                <w:sz w:val="19"/>
-              </w:rPr>
-              <w:t>DongDo@123</w:t>
-            </w:r>
-          </w:p>
-        </w:tc>
-        <w:tc>
-          <w:tcPr>
-            <w:tcW w:type="dxa" w:w="2484"/>
-            <w:shd w:fill="ffffff"/>
-            <w:tcMar>
-              <w:top w:w="80" w:type="dxa"/>
-              <w:bottom w:w="80" w:type="dxa"/>
-              <w:left w:w="120" w:type="dxa"/>
-              <w:right w:w="120" w:type="dxa"/>
-            </w:tcMar>
-          </w:tcPr>
-          <w:p>
-            <w:r>
-              <w:rPr>
-                <w:sz w:val="19"/>
-              </w:rPr>
-              <w:t>Khách hàng 04</w:t>
-            </w:r>
-          </w:p>
-        </w:tc>
-      </w:tr>
-      <w:tr>
-        <w:tc>
-          <w:tcPr>
-            <w:tcW w:type="dxa" w:w="2484"/>
-            <w:shd w:fill="f8fafc"/>
-            <w:tcMar>
-              <w:top w:w="80" w:type="dxa"/>
-              <w:bottom w:w="80" w:type="dxa"/>
-              <w:left w:w="120" w:type="dxa"/>
-              <w:right w:w="120" w:type="dxa"/>
-            </w:tcMar>
-          </w:tcPr>
-          <w:p>
-            <w:r>
-              <w:rPr>
-                <w:sz w:val="19"/>
-              </w:rPr>
-              <w:t>5</w:t>
-            </w:r>
-          </w:p>
-        </w:tc>
-        <w:tc>
-          <w:tcPr>
-            <w:tcW w:type="dxa" w:w="2484"/>
-            <w:shd w:fill="f8fafc"/>
-            <w:tcMar>
-              <w:top w:w="80" w:type="dxa"/>
-              <w:bottom w:w="80" w:type="dxa"/>
-              <w:left w:w="120" w:type="dxa"/>
-              <w:right w:w="120" w:type="dxa"/>
-            </w:tcMar>
-          </w:tcPr>
-          <w:p>
-            <w:r>
-              <w:rPr>
-                <w:sz w:val="19"/>
-              </w:rPr>
-              <w:t>khach05</w:t>
-            </w:r>
-          </w:p>
-        </w:tc>
-        <w:tc>
-          <w:tcPr>
-            <w:tcW w:type="dxa" w:w="2484"/>
-            <w:shd w:fill="f8fafc"/>
-            <w:tcMar>
-              <w:top w:w="80" w:type="dxa"/>
-              <w:bottom w:w="80" w:type="dxa"/>
-              <w:left w:w="120" w:type="dxa"/>
-              <w:right w:w="120" w:type="dxa"/>
-            </w:tcMar>
-          </w:tcPr>
-          <w:p>
-            <w:r>
-              <w:rPr>
-                <w:sz w:val="19"/>
-              </w:rPr>
-              <w:t>DongDo@123</w:t>
-            </w:r>
-          </w:p>
-        </w:tc>
-        <w:tc>
-          <w:tcPr>
-            <w:tcW w:type="dxa" w:w="2484"/>
-            <w:shd w:fill="f8fafc"/>
-            <w:tcMar>
-              <w:top w:w="80" w:type="dxa"/>
-              <w:bottom w:w="80" w:type="dxa"/>
-              <w:left w:w="120" w:type="dxa"/>
-              <w:right w:w="120" w:type="dxa"/>
-            </w:tcMar>
-          </w:tcPr>
-          <w:p>
-            <w:r>
-              <w:rPr>
-                <w:sz w:val="19"/>
-              </w:rPr>
-              <w:t>Khách hàng 05</w:t>
-            </w:r>
-          </w:p>
-        </w:tc>
-      </w:tr>
-    </w:tbl>
+    <w:p>
+      <w:pPr>
+        <w:pStyle w:val="ListBullet"/>
+      </w:pPr>
+      <w:r>
+        <w:rPr>
+          <w:b/>
+          <w:color w:val="2563EB"/>
+        </w:rPr>
+        <w:t xml:space="preserve">Cấp phát tài khoản riêng biệt: </w:t>
+      </w:r>
+      <w:r>
+        <w:t>Để đảm bảo an toàn thông tin và bảo mật dữ liệu, tài khoản đăng nhập (Tên đăng nhập &amp; Mật khẩu) được Ban Quản trị phân quyền và bàn giao riêng qua kênh bảo mật nội bộ.</w:t>
+      </w:r>
+    </w:p>
+    <w:p>
+      <w:pPr>
+        <w:pStyle w:val="ListBullet"/>
+      </w:pPr>
+      <w:r>
+        <w:rPr>
+          <w:b/>
+          <w:color w:val="2563EB"/>
+        </w:rPr>
+        <w:t xml:space="preserve">Nguyên tắc sử dụng: </w:t>
+      </w:r>
+      <w:r>
+        <w:t>Mỗi chuyên viên CSKH sử dụng đúng tài khoản được phân công để ghi nhận lịch sử tiếp nhận case và đánh giá hiệu quả hỗ trợ khách hàng.</w:t>
+      </w:r>
+    </w:p>
+    <w:p>
+      <w:pPr>
+        <w:pStyle w:val="ListBullet"/>
+      </w:pPr>
+      <w:r>
+        <w:rPr>
+          <w:b/>
+          <w:color w:val="2563EB"/>
+        </w:rPr>
+        <w:t xml:space="preserve">Hỗ trợ kỹ thuật: </w:t>
+      </w:r>
+      <w:r>
+        <w:t>Trường hợp cần cấp mới tài khoản, thay đổi mật khẩu hoặc phân quyền truy cập, vui lòng liên hệ trực tiếp Bộ phận Kỹ thuật / Quản trị viên hệ thống Đông Đô Partners.</w:t>
+      </w:r>
+    </w:p>
     <w:p>
       <w:pPr>
         <w:spacing w:after="240"/>

</xml_diff>